<commit_message>
Fix profile generation and PDF output
</commit_message>
<xml_diff>
--- a/templates/Trainer_Profile_Template.docx
+++ b/templates/Trainer_Profile_Template.docx
@@ -667,7 +667,7 @@
           <w:sz w:val="24"/>
           <w:szCs w:val="24"/>
         </w:rPr>
-        <w:t>Technical Expertise</w:t>
+        <w:t>Professional Certifications</w:t>
       </w:r>
     </w:p>
     <w:p>
@@ -686,14 +686,11 @@
           <w:sz w:val="22"/>
           <w:szCs w:val="22"/>
         </w:rPr>
-        <w:t>{{Technical Expertise}}</w:t>
+        <w:t>{{Certifications}}</w:t>
       </w:r>
     </w:p>
     <w:p>
       <w:pPr>
-        <w:spacing w:before="200" w:after="120"/>
-      </w:pPr>
-      <w:r>
         <w:rPr>
           <w:b/>
           <w:bCs/>
@@ -701,26 +698,48 @@
           <w:sz w:val="24"/>
           <w:szCs w:val="24"/>
         </w:rPr>
-        <w:t>Professional Certifications</w:t>
+      </w:pPr>
+      <w:r>
+        <w:rPr>
+          <w:b/>
+          <w:bCs/>
+          <w:color w:val="E97132" w:themeColor="accent2"/>
+          <w:sz w:val="24"/>
+          <w:szCs w:val="24"/>
+        </w:rPr>
+        <w:t>Professional Highlights</w:t>
       </w:r>
     </w:p>
     <w:p>
       <w:pPr>
-        <w:pBdr>
-          <w:bottom w:val="single" w:sz="6" w:space="4" w:color="999999"/>
-        </w:pBdr>
-        <w:spacing w:after="200"/>
+        <w:rPr>
+          <w:b/>
+          <w:bCs/>
+          <w:color w:val="E97132" w:themeColor="accent2"/>
+          <w:sz w:val="24"/>
+          <w:szCs w:val="24"/>
+        </w:rPr>
+      </w:pPr>
+      <w:r>
         <w:rPr>
           <w:sz w:val="22"/>
           <w:szCs w:val="22"/>
         </w:rPr>
-      </w:pPr>
+        <w:t>{{</w:t>
+      </w:r>
       <w:r>
         <w:rPr>
           <w:sz w:val="22"/>
           <w:szCs w:val="22"/>
         </w:rPr>
-        <w:t>{{Certifications}}</w:t>
+        <w:t>Professional Highlights</w:t>
+      </w:r>
+      <w:r>
+        <w:rPr>
+          <w:sz w:val="22"/>
+          <w:szCs w:val="22"/>
+        </w:rPr>
+        <w:t>}}</w:t>
       </w:r>
     </w:p>
     <w:p>
@@ -733,11 +752,30 @@
           <w:szCs w:val="24"/>
         </w:rPr>
       </w:pPr>
-      <w:r>
-        <w:rPr>
-          <w:b/>
-          <w:bCs/>
-          <w:color w:val="E97132" w:themeColor="accent2"/>
+    </w:p>
+    <w:p>
+      <w:pPr>
+        <w:rPr>
+          <w:b/>
+          <w:bCs/>
+          <w:color w:val="E97132" w:themeColor="accent2"/>
+          <w:sz w:val="24"/>
+          <w:szCs w:val="24"/>
+        </w:rPr>
+      </w:pPr>
+    </w:p>
+    <w:p>
+      <w:pPr>
+        <w:rPr>
+          <w:b/>
+          <w:bCs/>
+          <w:color w:val="E97132" w:themeColor="accent2"/>
+          <w:sz w:val="24"/>
+          <w:szCs w:val="24"/>
+        </w:rPr>
+      </w:pPr>
+      <w:r>
+        <w:rPr>
           <w:sz w:val="24"/>
           <w:szCs w:val="24"/>
         </w:rPr>
@@ -841,6 +879,7 @@
           <w:szCs w:val="24"/>
         </w:rPr>
       </w:pPr>
+      <w:proofErr w:type="spellStart"/>
       <w:r>
         <w:rPr>
           <w:b/>
@@ -849,7 +888,18 @@
           <w:sz w:val="24"/>
           <w:szCs w:val="24"/>
         </w:rPr>
-        <w:t>Leetcode Profile:</w:t>
+        <w:t>Leetcode</w:t>
+      </w:r>
+      <w:proofErr w:type="spellEnd"/>
+      <w:r>
+        <w:rPr>
+          <w:b/>
+          <w:bCs/>
+          <w:color w:val="E97132" w:themeColor="accent2"/>
+          <w:sz w:val="24"/>
+          <w:szCs w:val="24"/>
+        </w:rPr>
+        <w:t xml:space="preserve"> Profile:</w:t>
       </w:r>
     </w:p>
     <w:p>
@@ -870,12 +920,21 @@
         </w:rPr>
         <w:t>{{</w:t>
       </w:r>
+      <w:proofErr w:type="spellStart"/>
       <w:r>
         <w:rPr>
           <w:sz w:val="22"/>
           <w:szCs w:val="22"/>
         </w:rPr>
-        <w:t>LeetCode Profile Link</w:t>
+        <w:t>LeetCode</w:t>
+      </w:r>
+      <w:proofErr w:type="spellEnd"/>
+      <w:r>
+        <w:rPr>
+          <w:sz w:val="22"/>
+          <w:szCs w:val="22"/>
+        </w:rPr>
+        <w:t xml:space="preserve"> Profile Link</w:t>
       </w:r>
       <w:r>
         <w:rPr>
@@ -964,30 +1023,32 @@
     <w:p>
       <w:pPr>
         <w:spacing w:before="200" w:after="120"/>
-      </w:pPr>
-      <w:r>
         <w:rPr>
           <w:sz w:val="22"/>
           <w:szCs w:val="22"/>
         </w:rPr>
-        <w:t>{{</w:t>
-      </w:r>
-      <w:r>
-        <w:t>Other Profiles</w:t>
-      </w:r>
+      </w:pPr>
       <w:r>
         <w:rPr>
           <w:sz w:val="22"/>
           <w:szCs w:val="22"/>
         </w:rPr>
+        <w:t>{{</w:t>
+      </w:r>
+      <w:r>
+        <w:t>Other Profiles</w:t>
+      </w:r>
+      <w:r>
+        <w:rPr>
+          <w:sz w:val="22"/>
+          <w:szCs w:val="22"/>
+        </w:rPr>
         <w:t>}}</w:t>
       </w:r>
     </w:p>
     <w:p>
       <w:pPr>
         <w:spacing w:before="200" w:after="120"/>
-      </w:pPr>
-      <w:r>
         <w:rPr>
           <w:b/>
           <w:bCs/>
@@ -995,33 +1056,210 @@
           <w:sz w:val="24"/>
           <w:szCs w:val="24"/>
         </w:rPr>
-        <w:t>Training Expertise</w:t>
+      </w:pPr>
+      <w:r>
+        <w:rPr>
+          <w:b/>
+          <w:bCs/>
+          <w:noProof/>
+          <w:color w:val="E97132" w:themeColor="accent2"/>
+          <w:sz w:val="24"/>
+          <w:szCs w:val="24"/>
+        </w:rPr>
+        <mc:AlternateContent>
+          <mc:Choice Requires="wps">
+            <w:drawing>
+              <wp:anchor distT="0" distB="0" distL="114300" distR="114300" simplePos="0" relativeHeight="251663360" behindDoc="0" locked="0" layoutInCell="1" allowOverlap="1" wp14:anchorId="24686E82" wp14:editId="53AF3B82">
+                <wp:simplePos x="0" y="0"/>
+                <wp:positionH relativeFrom="column">
+                  <wp:posOffset>-58737</wp:posOffset>
+                </wp:positionH>
+                <wp:positionV relativeFrom="paragraph">
+                  <wp:posOffset>126048</wp:posOffset>
+                </wp:positionV>
+                <wp:extent cx="6610350" cy="33337"/>
+                <wp:effectExtent l="0" t="0" r="19050" b="24130"/>
+                <wp:wrapNone/>
+                <wp:docPr id="2144414017" name="Straight Connector 3"/>
+                <wp:cNvGraphicFramePr/>
+                <a:graphic xmlns:a="http://schemas.openxmlformats.org/drawingml/2006/main">
+                  <a:graphicData uri="http://schemas.microsoft.com/office/word/2010/wordprocessingShape">
+                    <wps:wsp>
+                      <wps:cNvCnPr/>
+                      <wps:spPr>
+                        <a:xfrm flipV="1">
+                          <a:off x="0" y="0"/>
+                          <a:ext cx="6610350" cy="33337"/>
+                        </a:xfrm>
+                        <a:prstGeom prst="line">
+                          <a:avLst/>
+                        </a:prstGeom>
+                        <a:ln w="6350"/>
+                      </wps:spPr>
+                      <wps:style>
+                        <a:lnRef idx="2">
+                          <a:schemeClr val="accent1"/>
+                        </a:lnRef>
+                        <a:fillRef idx="0">
+                          <a:schemeClr val="accent1"/>
+                        </a:fillRef>
+                        <a:effectRef idx="1">
+                          <a:schemeClr val="accent1"/>
+                        </a:effectRef>
+                        <a:fontRef idx="minor">
+                          <a:schemeClr val="tx1"/>
+                        </a:fontRef>
+                      </wps:style>
+                      <wps:bodyPr/>
+                    </wps:wsp>
+                  </a:graphicData>
+                </a:graphic>
+              </wp:anchor>
+            </w:drawing>
+          </mc:Choice>
+          <mc:Fallback>
+            <w:pict>
+              <v:line w14:anchorId="6BDA92D6" id="Straight Connector 3" o:spid="_x0000_s1026" style="position:absolute;flip:y;z-index:251663360;visibility:visible;mso-wrap-style:square;mso-wrap-distance-left:9pt;mso-wrap-distance-top:0;mso-wrap-distance-right:9pt;mso-wrap-distance-bottom:0;mso-position-horizontal:absolute;mso-position-horizontal-relative:text;mso-position-vertical:absolute;mso-position-vertical-relative:text" from="-4.6pt,9.95pt" to="515.9pt,12.55pt" o:gfxdata="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" strokecolor="#156082 [3204]" strokeweight=".5pt">
+                <v:stroke joinstyle="miter"/>
+              </v:line>
+            </w:pict>
+          </mc:Fallback>
+        </mc:AlternateContent>
+      </w:r>
+      <w:r>
+        <w:rPr>
+          <w:b/>
+          <w:bCs/>
+          <w:color w:val="E97132" w:themeColor="accent2"/>
+          <w:sz w:val="24"/>
+          <w:szCs w:val="24"/>
+        </w:rPr>
+        <w:t> </w:t>
       </w:r>
     </w:p>
     <w:p>
       <w:pPr>
-        <w:pBdr>
-          <w:bottom w:val="single" w:sz="6" w:space="4" w:color="999999"/>
-        </w:pBdr>
-        <w:spacing w:after="200"/>
+        <w:spacing w:before="200" w:after="120"/>
+        <w:rPr>
+          <w:b/>
+          <w:bCs/>
+          <w:color w:val="E97132" w:themeColor="accent2"/>
+          <w:sz w:val="24"/>
+          <w:szCs w:val="24"/>
+        </w:rPr>
+      </w:pPr>
+      <w:r>
+        <w:rPr>
+          <w:b/>
+          <w:bCs/>
+          <w:color w:val="E97132" w:themeColor="accent2"/>
+          <w:sz w:val="24"/>
+          <w:szCs w:val="24"/>
+        </w:rPr>
+        <w:t>Training Expertise</w:t>
+      </w:r>
+    </w:p>
+    <w:p>
+      <w:pPr>
+        <w:spacing w:before="200" w:after="120"/>
+        <w:rPr>
+          <w:b/>
+          <w:bCs/>
+          <w:color w:val="E97132" w:themeColor="accent2"/>
+          <w:sz w:val="24"/>
+          <w:szCs w:val="24"/>
+        </w:rPr>
+      </w:pPr>
+      <w:r>
         <w:rPr>
           <w:sz w:val="22"/>
           <w:szCs w:val="22"/>
         </w:rPr>
-      </w:pPr>
+        <w:t>{{</w:t>
+      </w:r>
+      <w:r>
+        <w:t>Training Expertise</w:t>
+      </w:r>
       <w:r>
         <w:rPr>
           <w:sz w:val="22"/>
           <w:szCs w:val="22"/>
         </w:rPr>
-        <w:t>{{Training Expertise}}</w:t>
+        <w:t>}}</w:t>
+      </w:r>
+      <w:r>
+        <w:rPr>
+          <w:b/>
+          <w:bCs/>
+          <w:noProof/>
+          <w:color w:val="E97132" w:themeColor="accent2"/>
+          <w:sz w:val="24"/>
+          <w:szCs w:val="24"/>
+        </w:rPr>
+        <mc:AlternateContent>
+          <mc:Choice Requires="wps">
+            <w:drawing>
+              <wp:anchor distT="0" distB="0" distL="114300" distR="114300" simplePos="0" relativeHeight="251665408" behindDoc="0" locked="0" layoutInCell="1" allowOverlap="1" wp14:anchorId="1D0531A0" wp14:editId="339EC237">
+                <wp:simplePos x="0" y="0"/>
+                <wp:positionH relativeFrom="column">
+                  <wp:posOffset>-35242</wp:posOffset>
+                </wp:positionH>
+                <wp:positionV relativeFrom="paragraph">
+                  <wp:posOffset>273685</wp:posOffset>
+                </wp:positionV>
+                <wp:extent cx="6610350" cy="33337"/>
+                <wp:effectExtent l="0" t="0" r="19050" b="24130"/>
+                <wp:wrapNone/>
+                <wp:docPr id="735452907" name="Straight Connector 3"/>
+                <wp:cNvGraphicFramePr/>
+                <a:graphic xmlns:a="http://schemas.openxmlformats.org/drawingml/2006/main">
+                  <a:graphicData uri="http://schemas.microsoft.com/office/word/2010/wordprocessingShape">
+                    <wps:wsp>
+                      <wps:cNvCnPr/>
+                      <wps:spPr>
+                        <a:xfrm flipV="1">
+                          <a:off x="0" y="0"/>
+                          <a:ext cx="6610350" cy="33337"/>
+                        </a:xfrm>
+                        <a:prstGeom prst="line">
+                          <a:avLst/>
+                        </a:prstGeom>
+                        <a:ln w="6350"/>
+                      </wps:spPr>
+                      <wps:style>
+                        <a:lnRef idx="2">
+                          <a:schemeClr val="accent1"/>
+                        </a:lnRef>
+                        <a:fillRef idx="0">
+                          <a:schemeClr val="accent1"/>
+                        </a:fillRef>
+                        <a:effectRef idx="1">
+                          <a:schemeClr val="accent1"/>
+                        </a:effectRef>
+                        <a:fontRef idx="minor">
+                          <a:schemeClr val="tx1"/>
+                        </a:fontRef>
+                      </wps:style>
+                      <wps:bodyPr/>
+                    </wps:wsp>
+                  </a:graphicData>
+                </a:graphic>
+              </wp:anchor>
+            </w:drawing>
+          </mc:Choice>
+          <mc:Fallback>
+            <w:pict>
+              <v:line w14:anchorId="243F9F57" id="Straight Connector 3" o:spid="_x0000_s1026" style="position:absolute;flip:y;z-index:251665408;visibility:visible;mso-wrap-style:square;mso-wrap-distance-left:9pt;mso-wrap-distance-top:0;mso-wrap-distance-right:9pt;mso-wrap-distance-bottom:0;mso-position-horizontal:absolute;mso-position-horizontal-relative:text;mso-position-vertical:absolute;mso-position-vertical-relative:text" from="-2.75pt,21.55pt" to="517.75pt,24.15pt" o:gfxdata="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" strokecolor="#156082 [3204]" strokeweight=".5pt">
+                <v:stroke joinstyle="miter"/>
+              </v:line>
+            </w:pict>
+          </mc:Fallback>
+        </mc:AlternateContent>
       </w:r>
     </w:p>
     <w:p>
       <w:pPr>
         <w:spacing w:before="200" w:after="120"/>
-      </w:pPr>
-      <w:r>
         <w:rPr>
           <w:b/>
           <w:bCs/>
@@ -1029,31 +1267,28 @@
           <w:sz w:val="24"/>
           <w:szCs w:val="24"/>
         </w:rPr>
-        <w:t>Professional Highlights</w:t>
+      </w:pPr>
+      <w:r>
+        <w:rPr>
+          <w:b/>
+          <w:bCs/>
+          <w:color w:val="E97132" w:themeColor="accent2"/>
+          <w:sz w:val="24"/>
+          <w:szCs w:val="24"/>
+        </w:rPr>
+        <w:t>Core Competencies</w:t>
       </w:r>
     </w:p>
     <w:p>
       <w:pPr>
-        <w:pBdr>
-          <w:bottom w:val="single" w:sz="6" w:space="4" w:color="999999"/>
-        </w:pBdr>
-        <w:spacing w:after="200"/>
-        <w:rPr>
-          <w:sz w:val="22"/>
-          <w:szCs w:val="22"/>
-        </w:rPr>
-      </w:pPr>
-      <w:r>
-        <w:rPr>
-          <w:sz w:val="22"/>
-          <w:szCs w:val="22"/>
-        </w:rPr>
-        <w:t>{{Professional Highlights}}</w:t>
+        <w:spacing w:before="200" w:after="120"/>
+      </w:pPr>
+      <w:r>
+        <w:t>{{Core Competencies}}</w:t>
       </w:r>
     </w:p>
     <w:p>
       <w:pPr>
-        <w:spacing w:before="200" w:after="120"/>
         <w:rPr>
           <w:b/>
           <w:bCs/>
@@ -1066,23 +1301,85 @@
         <w:rPr>
           <w:b/>
           <w:bCs/>
+          <w:noProof/>
           <w:color w:val="E97132" w:themeColor="accent2"/>
           <w:sz w:val="24"/>
           <w:szCs w:val="24"/>
         </w:rPr>
-        <w:t>Core Competencies</w:t>
+        <mc:AlternateContent>
+          <mc:Choice Requires="wps">
+            <w:drawing>
+              <wp:anchor distT="0" distB="0" distL="114300" distR="114300" simplePos="0" relativeHeight="251667456" behindDoc="0" locked="0" layoutInCell="1" allowOverlap="1" wp14:anchorId="769C71D1" wp14:editId="6F8BF1AD">
+                <wp:simplePos x="0" y="0"/>
+                <wp:positionH relativeFrom="column">
+                  <wp:posOffset>-1905</wp:posOffset>
+                </wp:positionH>
+                <wp:positionV relativeFrom="paragraph">
+                  <wp:posOffset>130175</wp:posOffset>
+                </wp:positionV>
+                <wp:extent cx="6610350" cy="33337"/>
+                <wp:effectExtent l="0" t="0" r="19050" b="24130"/>
+                <wp:wrapNone/>
+                <wp:docPr id="380796736" name="Straight Connector 3"/>
+                <wp:cNvGraphicFramePr/>
+                <a:graphic xmlns:a="http://schemas.openxmlformats.org/drawingml/2006/main">
+                  <a:graphicData uri="http://schemas.microsoft.com/office/word/2010/wordprocessingShape">
+                    <wps:wsp>
+                      <wps:cNvCnPr/>
+                      <wps:spPr>
+                        <a:xfrm flipV="1">
+                          <a:off x="0" y="0"/>
+                          <a:ext cx="6610350" cy="33337"/>
+                        </a:xfrm>
+                        <a:prstGeom prst="line">
+                          <a:avLst/>
+                        </a:prstGeom>
+                        <a:ln w="6350"/>
+                      </wps:spPr>
+                      <wps:style>
+                        <a:lnRef idx="2">
+                          <a:schemeClr val="accent1"/>
+                        </a:lnRef>
+                        <a:fillRef idx="0">
+                          <a:schemeClr val="accent1"/>
+                        </a:fillRef>
+                        <a:effectRef idx="1">
+                          <a:schemeClr val="accent1"/>
+                        </a:effectRef>
+                        <a:fontRef idx="minor">
+                          <a:schemeClr val="tx1"/>
+                        </a:fontRef>
+                      </wps:style>
+                      <wps:bodyPr/>
+                    </wps:wsp>
+                  </a:graphicData>
+                </a:graphic>
+              </wp:anchor>
+            </w:drawing>
+          </mc:Choice>
+          <mc:Fallback>
+            <w:pict>
+              <v:line w14:anchorId="56957858" id="Straight Connector 3" o:spid="_x0000_s1026" style="position:absolute;flip:y;z-index:251667456;visibility:visible;mso-wrap-style:square;mso-wrap-distance-left:9pt;mso-wrap-distance-top:0;mso-wrap-distance-right:9pt;mso-wrap-distance-bottom:0;mso-position-horizontal:absolute;mso-position-horizontal-relative:text;mso-position-vertical:absolute;mso-position-vertical-relative:text" from="-.15pt,10.25pt" to="520.35pt,12.85pt" o:gfxdata="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" strokecolor="#156082 [3204]" strokeweight=".5pt">
+                <v:stroke joinstyle="miter"/>
+              </v:line>
+            </w:pict>
+          </mc:Fallback>
+        </mc:AlternateContent>
+      </w:r>
+      <w:r>
+        <w:rPr>
+          <w:b/>
+          <w:bCs/>
+          <w:color w:val="E97132" w:themeColor="accent2"/>
+          <w:sz w:val="24"/>
+          <w:szCs w:val="24"/>
+        </w:rPr>
+        <w:br w:type="page"/>
       </w:r>
     </w:p>
     <w:p>
       <w:pPr>
         <w:spacing w:before="200" w:after="120"/>
-      </w:pPr>
-      <w:r>
-        <w:t>{{Core Competencies}}</w:t>
-      </w:r>
-    </w:p>
-    <w:p>
-      <w:pPr>
         <w:rPr>
           <w:b/>
           <w:bCs/>
@@ -1099,101 +1396,9 @@
           <w:sz w:val="24"/>
           <w:szCs w:val="24"/>
         </w:rPr>
-        <w:br w:type="page"/>
-      </w:r>
-    </w:p>
-    <w:p>
-      <w:pPr>
-        <w:rPr>
-          <w:b/>
-          <w:bCs/>
-          <w:color w:val="E97132" w:themeColor="accent2"/>
-          <w:sz w:val="24"/>
-          <w:szCs w:val="24"/>
-        </w:rPr>
-      </w:pPr>
-      <w:r>
-        <w:rPr>
-          <w:b/>
-          <w:bCs/>
-          <w:color w:val="E97132" w:themeColor="accent2"/>
-          <w:sz w:val="24"/>
-          <w:szCs w:val="24"/>
-        </w:rPr>
         <w:lastRenderedPageBreak/>
-        <w:t>Training Projects</w:t>
-      </w:r>
-    </w:p>
-    <w:p>
-      <w:pPr>
-        <w:spacing w:before="200" w:after="120"/>
-        <w:rPr>
-          <w:b/>
-          <w:bCs/>
-          <w:color w:val="E97132" w:themeColor="accent2"/>
-          <w:sz w:val="24"/>
-          <w:szCs w:val="24"/>
-        </w:rPr>
-      </w:pPr>
-      <w:r>
-        <w:rPr>
-          <w:b/>
-          <w:bCs/>
-          <w:color w:val="E97132" w:themeColor="accent2"/>
-          <w:sz w:val="24"/>
-          <w:szCs w:val="24"/>
-        </w:rPr>
-        <w:t>Ongoing Project(s)</w:t>
-      </w:r>
-      <w:r>
-        <w:rPr>
-          <w:b/>
-          <w:bCs/>
-          <w:color w:val="E97132" w:themeColor="accent2"/>
-          <w:sz w:val="24"/>
-          <w:szCs w:val="24"/>
-        </w:rPr>
-        <w:t>:</w:t>
-      </w:r>
-    </w:p>
-    <w:p>
-      <w:pPr>
-        <w:spacing w:before="200" w:after="120"/>
-        <w:rPr>
-          <w:b/>
-          <w:bCs/>
-          <w:color w:val="E97132" w:themeColor="accent2"/>
-          <w:sz w:val="24"/>
-          <w:szCs w:val="24"/>
-        </w:rPr>
-      </w:pPr>
-    </w:p>
-    <w:p>
-      <w:pPr>
-        <w:spacing w:before="200" w:after="120"/>
-        <w:rPr>
-          <w:b/>
-          <w:bCs/>
-          <w:color w:val="E97132" w:themeColor="accent2"/>
-          <w:sz w:val="24"/>
-          <w:szCs w:val="24"/>
-        </w:rPr>
-      </w:pPr>
-      <w:r>
-        <w:rPr>
-          <w:b/>
-          <w:bCs/>
-          <w:color w:val="E97132" w:themeColor="accent2"/>
-          <w:sz w:val="24"/>
-          <w:szCs w:val="24"/>
-        </w:rPr>
-        <w:t>Completed Projects:</w:t>
-      </w:r>
-    </w:p>
-    <w:p>
-      <w:pPr>
-        <w:spacing w:after="100"/>
-      </w:pPr>
+        <w:t>Training Projects:</w:t>
+      </w:r>
     </w:p>
     <w:sectPr>
       <w:pgSz w:w="12240" w:h="15840"/>
@@ -2477,7 +2682,6 @@
   <w:style w:type="character" w:default="1" w:styleId="DefaultParagraphFont">
     <w:name w:val="Default Paragraph Font"/>
     <w:uiPriority w:val="1"/>
-    <w:semiHidden/>
     <w:unhideWhenUsed/>
   </w:style>
   <w:style w:type="table" w:default="1" w:styleId="TableNormal">

</xml_diff>